<commit_message>
docs: add Ruofan's pipelines, optimisation and benchmark sections to group report
</commit_message>
<xml_diff>
--- a/report/NumCompute-report.docx
+++ b/report/NumCompute-report.docx
@@ -1096,6 +1096,882 @@
       </w:r>
     </w:p>
     <w:p>
+      <w:r>
+        <w:rPr/>
+        <w:t xml:space="preserve">These modules use Python and NumPy. </w:t>
+      </w:r>
+      <w:r>
+        <w:rPr>
+          <w:rFonts w:ascii="Consolas" w:hAnsi="Consolas" w:eastAsia="Consolas"/>
+        </w:rPr>
+        <w:t>grad</w:t>
+      </w:r>
+      <w:r>
+        <w:rPr/>
+        <w:t xml:space="preserve"> and </w:t>
+      </w:r>
+      <w:r>
+        <w:rPr>
+          <w:rFonts w:ascii="Consolas" w:hAnsi="Consolas" w:eastAsia="Consolas"/>
+        </w:rPr>
+        <w:t>jacobian</w:t>
+      </w:r>
+      <w:r>
+        <w:rPr/>
+        <w:t xml:space="preserve"> support forward, backward and central finite differences. For n inputs, one-sided schemes require n + 1 function evaluations; central schemes require 2n for gradients and 2n + 1 for Jacobians. For smooth functions, one-sided schemes have O(h) truncation error and central schemes have O(h²) truncation error. Validation rejects invalid arguments, inconsistent output shapes, ineffective perturbations and non-finite inputs, evaluations or derivatives, including overflow. Float64 copies preserve caller inputs.</w:t>
+      </w:r>
+    </w:p>
+    <w:p>
+      <w:r>
+        <w:rPr>
+          <w:rFonts w:ascii="Consolas" w:hAnsi="Consolas" w:eastAsia="Consolas"/>
+        </w:rPr>
+        <w:t>Transformer</w:t>
+      </w:r>
+      <w:r>
+        <w:rPr/>
+        <w:t xml:space="preserve"> and </w:t>
+      </w:r>
+      <w:r>
+        <w:rPr>
+          <w:rFonts w:ascii="Consolas" w:hAnsi="Consolas" w:eastAsia="Consolas"/>
+        </w:rPr>
+        <w:t>Estimator</w:t>
+      </w:r>
+      <w:r>
+        <w:rPr/>
+        <w:t xml:space="preserve"> protocols define composition interfaces. </w:t>
+      </w:r>
+      <w:r>
+        <w:rPr>
+          <w:rFonts w:ascii="Consolas" w:hAnsi="Consolas" w:eastAsia="Consolas"/>
+        </w:rPr>
+        <w:t>Pipeline</w:t>
+      </w:r>
+      <w:r>
+        <w:rPr/>
+        <w:t xml:space="preserve"> fits steps sequentially, forwards targets only to a final estimator, and reuses fitted state for transformation or prediction. </w:t>
+      </w:r>
+      <w:r>
+        <w:rPr>
+          <w:rFonts w:ascii="Consolas" w:hAnsi="Consolas" w:eastAsia="Consolas"/>
+        </w:rPr>
+        <w:t>FeatureUnion</w:t>
+      </w:r>
+      <w:r>
+        <w:rPr/>
+        <w:t xml:space="preserve"> fits branches on independent input copies and concatenates features in branch order. Containers check fitted state, unique nonempty names, callable methods, two-dimensional arrays and row preservation. Step objects are fitted directly. There is no global fixed feature-count restriction: </w:t>
+      </w:r>
+      <w:r>
+        <w:rPr>
+          <w:rFonts w:ascii="Consolas" w:hAnsi="Consolas" w:eastAsia="Consolas"/>
+        </w:rPr>
+        <w:t>n_features_in_</w:t>
+      </w:r>
+      <w:r>
+        <w:rPr/>
+        <w:t xml:space="preserve"> is metadata; compatibility belongs to individual steps.</w:t>
+      </w:r>
+    </w:p>
+    <w:p>
+      <w:r>
+        <w:rPr>
+          <w:rFonts w:ascii="Consolas" w:hAnsi="Consolas" w:eastAsia="Consolas"/>
+        </w:rPr>
+        <w:t>sigmoid</w:t>
+      </w:r>
+      <w:r>
+        <w:rPr/>
+        <w:t xml:space="preserve"> uses sign-dependent evaluation; </w:t>
+      </w:r>
+      <w:r>
+        <w:rPr>
+          <w:rFonts w:ascii="Consolas" w:hAnsi="Consolas" w:eastAsia="Consolas"/>
+        </w:rPr>
+        <w:t>relu</w:t>
+      </w:r>
+      <w:r>
+        <w:rPr/>
+        <w:t xml:space="preserve"> applies an elementwise maximum. </w:t>
+      </w:r>
+      <w:r>
+        <w:rPr>
+          <w:rFonts w:ascii="Consolas" w:hAnsi="Consolas" w:eastAsia="Consolas"/>
+        </w:rPr>
+        <w:t>softmax</w:t>
+      </w:r>
+      <w:r>
+        <w:rPr/>
+        <w:t xml:space="preserve"> and </w:t>
+      </w:r>
+      <w:r>
+        <w:rPr>
+          <w:rFonts w:ascii="Consolas" w:hAnsi="Consolas" w:eastAsia="Consolas"/>
+        </w:rPr>
+        <w:t>logsumexp</w:t>
+      </w:r>
+      <w:r>
+        <w:rPr/>
+        <w:t xml:space="preserve"> subtract maxima before exponentiation; the latter handles empty and non-finite slices. Python-integer temporaries preserve integer differences, with a rounding-residual correction in </w:t>
+      </w:r>
+      <w:r>
+        <w:rPr>
+          <w:rFonts w:ascii="Consolas" w:hAnsi="Consolas" w:eastAsia="Consolas"/>
+        </w:rPr>
+        <w:t>logsumexp</w:t>
+      </w:r>
+      <w:r>
+        <w:rPr/>
+        <w:t xml:space="preserve">. </w:t>
+      </w:r>
+      <w:r>
+        <w:rPr>
+          <w:rFonts w:ascii="Consolas" w:hAnsi="Consolas" w:eastAsia="Consolas"/>
+        </w:rPr>
+        <w:t>euclidean_distance</w:t>
+      </w:r>
+      <w:r>
+        <w:rPr/>
+        <w:t xml:space="preserve"> uses </w:t>
+      </w:r>
+      <w:r>
+        <w:rPr>
+          <w:rFonts w:ascii="Consolas" w:hAnsi="Consolas" w:eastAsia="Consolas"/>
+        </w:rPr>
+        <w:t>np.hypot.reduce</w:t>
+      </w:r>
+      <w:r>
+        <w:rPr/>
+        <w:t xml:space="preserve"> to avoid unnecessary overflow; </w:t>
+      </w:r>
+      <w:r>
+        <w:rPr>
+          <w:rFonts w:ascii="Consolas" w:hAnsi="Consolas" w:eastAsia="Consolas"/>
+        </w:rPr>
+        <w:t>manhattan_distance</w:t>
+      </w:r>
+      <w:r>
+        <w:rPr/>
+        <w:t xml:space="preserve"> sums absolute differences. Two integer distance inputs are subtracted before float conversion, avoiding wraparound and lost gaps. </w:t>
+      </w:r>
+      <w:r>
+        <w:rPr>
+          <w:rFonts w:ascii="Consolas" w:hAnsi="Consolas" w:eastAsia="Consolas"/>
+        </w:rPr>
+        <w:t>iter_batches</w:t>
+      </w:r>
+      <w:r>
+        <w:rPr/>
+        <w:t xml:space="preserve"> yields ordered views whose modification can affect the source. The duplicate </w:t>
+      </w:r>
+      <w:r>
+        <w:rPr>
+          <w:rFonts w:ascii="Consolas" w:hAnsi="Consolas" w:eastAsia="Consolas"/>
+        </w:rPr>
+        <w:t>top_k_indices</w:t>
+      </w:r>
+      <w:r>
+        <w:rPr/>
+        <w:t xml:space="preserve"> was deliberately removed; the designated single implementation, </w:t>
+      </w:r>
+      <w:r>
+        <w:rPr>
+          <w:rFonts w:ascii="Consolas" w:hAnsi="Consolas" w:eastAsia="Consolas"/>
+        </w:rPr>
+        <w:t>sort_search.topk</w:t>
+      </w:r>
+      <w:r>
+        <w:rPr/>
+        <w:t>, awaits integration.</w:t>
+      </w:r>
+    </w:p>
+    <w:p>
+      <w:r>
+        <w:rPr/>
+        <w:t>Below, m is derivative output size, N input elements, Q reduction output elements, Nᵢ pipeline intermediate sizes, b branches, M concatenated elements and B batches. C and R denote benchmark cases and repeats.</w:t>
+      </w:r>
+    </w:p>
+    <w:tbl>
+      <w:tblPr>
+        <w:tblStyle w:val="TableGrid"/>
+        <w:tblW w:type="auto" w:w="0"/>
+        <w:jc w:val="center"/>
+        <w:tblLook w:firstColumn="1" w:firstRow="1" w:lastColumn="0" w:lastRow="0" w:noHBand="0" w:noVBand="1" w:val="04A0"/>
+        <w:tblBorders>
+          <w:top w:val="single" w:sz="4" w:color="808080"/>
+          <w:left w:val="single" w:sz="4" w:color="808080"/>
+          <w:bottom w:val="single" w:sz="4" w:color="808080"/>
+          <w:right w:val="single" w:sz="4" w:color="808080"/>
+          <w:insideH w:val="single" w:sz="4" w:color="808080"/>
+          <w:insideV w:val="single" w:sz="4" w:color="808080"/>
+        </w:tblBorders>
+      </w:tblPr>
+      <w:tblGrid>
+        <w:gridCol w:w="2409"/>
+        <w:gridCol w:w="2409"/>
+        <w:gridCol w:w="2409"/>
+        <w:gridCol w:w="2409"/>
+      </w:tblGrid>
+      <w:tr>
+        <w:tc>
+          <w:tcPr>
+            <w:tcW w:type="dxa" w:w="2409"/>
+            <w:shd w:val="clear" w:color="auto" w:fill="D9E2F3"/>
+          </w:tcPr>
+          <w:p>
+            <w:pPr>
+              <w:spacing w:after="0"/>
+            </w:pPr>
+            <w:r>
+              <w:rPr>
+                <w:b/>
+                <w:sz w:val="18"/>
+              </w:rPr>
+              <w:t>Component</w:t>
+            </w:r>
+          </w:p>
+        </w:tc>
+        <w:tc>
+          <w:tcPr>
+            <w:tcW w:type="dxa" w:w="2409"/>
+            <w:shd w:val="clear" w:color="auto" w:fill="D9E2F3"/>
+          </w:tcPr>
+          <w:p>
+            <w:pPr>
+              <w:spacing w:after="0"/>
+            </w:pPr>
+            <w:r>
+              <w:rPr>
+                <w:b/>
+                <w:sz w:val="18"/>
+              </w:rPr>
+              <w:t>Technique/design</w:t>
+            </w:r>
+          </w:p>
+        </w:tc>
+        <w:tc>
+          <w:tcPr>
+            <w:tcW w:type="dxa" w:w="2409"/>
+            <w:shd w:val="clear" w:color="auto" w:fill="D9E2F3"/>
+          </w:tcPr>
+          <w:p>
+            <w:pPr>
+              <w:spacing w:after="0"/>
+            </w:pPr>
+            <w:r>
+              <w:rPr>
+                <w:b/>
+                <w:sz w:val="18"/>
+              </w:rPr>
+              <w:t>Time complexity</w:t>
+            </w:r>
+          </w:p>
+        </w:tc>
+        <w:tc>
+          <w:tcPr>
+            <w:tcW w:type="dxa" w:w="2409"/>
+            <w:shd w:val="clear" w:color="auto" w:fill="D9E2F3"/>
+          </w:tcPr>
+          <w:p>
+            <w:pPr>
+              <w:spacing w:after="0"/>
+            </w:pPr>
+            <w:r>
+              <w:rPr>
+                <w:b/>
+                <w:sz w:val="18"/>
+              </w:rPr>
+              <w:t>Key contract</w:t>
+            </w:r>
+          </w:p>
+        </w:tc>
+      </w:tr>
+      <w:tr>
+        <w:tc>
+          <w:tcPr>
+            <w:tcW w:type="dxa" w:w="2409"/>
+          </w:tcPr>
+          <w:p>
+            <w:pPr>
+              <w:spacing w:after="0"/>
+            </w:pPr>
+            <w:r>
+              <w:rPr>
+                <w:rFonts w:ascii="Consolas" w:hAnsi="Consolas" w:eastAsia="Consolas"/>
+                <w:sz w:val="18"/>
+              </w:rPr>
+              <w:t>grad</w:t>
+            </w:r>
+            <w:r>
+              <w:rPr>
+                <w:sz w:val="18"/>
+              </w:rPr>
+              <w:t xml:space="preserve"> / </w:t>
+            </w:r>
+            <w:r>
+              <w:rPr>
+                <w:rFonts w:ascii="Consolas" w:hAnsi="Consolas" w:eastAsia="Consolas"/>
+                <w:sz w:val="18"/>
+              </w:rPr>
+              <w:t>jacobian</w:t>
+            </w:r>
+          </w:p>
+        </w:tc>
+        <w:tc>
+          <w:tcPr>
+            <w:tcW w:type="dxa" w:w="2409"/>
+          </w:tcPr>
+          <w:p>
+            <w:pPr>
+              <w:spacing w:after="0"/>
+            </w:pPr>
+            <w:r>
+              <w:rPr>
+                <w:sz w:val="18"/>
+              </w:rPr>
+              <w:t>Coordinate differences</w:t>
+            </w:r>
+          </w:p>
+        </w:tc>
+        <w:tc>
+          <w:tcPr>
+            <w:tcW w:type="dxa" w:w="2409"/>
+          </w:tcPr>
+          <w:p>
+            <w:pPr>
+              <w:spacing w:after="0"/>
+            </w:pPr>
+            <w:r>
+              <w:rPr>
+                <w:rFonts w:ascii="Consolas" w:hAnsi="Consolas" w:eastAsia="Consolas"/>
+                <w:sz w:val="18"/>
+              </w:rPr>
+              <w:t>O(n²)</w:t>
+            </w:r>
+            <w:r>
+              <w:rPr>
+                <w:sz w:val="18"/>
+              </w:rPr>
+              <w:t xml:space="preserve"> / </w:t>
+            </w:r>
+            <w:r>
+              <w:rPr>
+                <w:rFonts w:ascii="Consolas" w:hAnsi="Consolas" w:eastAsia="Consolas"/>
+                <w:sz w:val="18"/>
+              </w:rPr>
+              <w:t>O(n² + mn)</w:t>
+            </w:r>
+            <w:r>
+              <w:rPr>
+                <w:sz w:val="18"/>
+              </w:rPr>
+              <w:t>, plus evaluations</w:t>
+            </w:r>
+          </w:p>
+        </w:tc>
+        <w:tc>
+          <w:tcPr>
+            <w:tcW w:type="dxa" w:w="2409"/>
+          </w:tcPr>
+          <w:p>
+            <w:pPr>
+              <w:spacing w:after="0"/>
+            </w:pPr>
+            <w:r>
+              <w:rPr>
+                <w:sz w:val="18"/>
+              </w:rPr>
+              <w:t xml:space="preserve">Outputs (n,) / (m, n); space </w:t>
+            </w:r>
+            <w:r>
+              <w:rPr>
+                <w:rFonts w:ascii="Consolas" w:hAnsi="Consolas" w:eastAsia="Consolas"/>
+                <w:sz w:val="18"/>
+              </w:rPr>
+              <w:t>O(n)</w:t>
+            </w:r>
+            <w:r>
+              <w:rPr>
+                <w:sz w:val="18"/>
+              </w:rPr>
+              <w:t xml:space="preserve"> / </w:t>
+            </w:r>
+            <w:r>
+              <w:rPr>
+                <w:rFonts w:ascii="Consolas" w:hAnsi="Consolas" w:eastAsia="Consolas"/>
+                <w:sz w:val="18"/>
+              </w:rPr>
+              <w:t>O(mn + n + m)</w:t>
+            </w:r>
+            <w:r>
+              <w:rPr>
+                <w:sz w:val="18"/>
+              </w:rPr>
+              <w:t>, excluding callable allocations</w:t>
+            </w:r>
+          </w:p>
+        </w:tc>
+      </w:tr>
+      <w:tr>
+        <w:tc>
+          <w:tcPr>
+            <w:tcW w:type="dxa" w:w="2409"/>
+          </w:tcPr>
+          <w:p>
+            <w:pPr>
+              <w:spacing w:after="0"/>
+            </w:pPr>
+            <w:r>
+              <w:rPr>
+                <w:rFonts w:ascii="Consolas" w:hAnsi="Consolas" w:eastAsia="Consolas"/>
+                <w:sz w:val="18"/>
+              </w:rPr>
+              <w:t>Pipeline</w:t>
+            </w:r>
+          </w:p>
+        </w:tc>
+        <w:tc>
+          <w:tcPr>
+            <w:tcW w:type="dxa" w:w="2409"/>
+          </w:tcPr>
+          <w:p>
+            <w:pPr>
+              <w:spacing w:after="0"/>
+            </w:pPr>
+            <w:r>
+              <w:rPr>
+                <w:sz w:val="18"/>
+              </w:rPr>
+              <w:t>Sequential composition</w:t>
+            </w:r>
+          </w:p>
+        </w:tc>
+        <w:tc>
+          <w:tcPr>
+            <w:tcW w:type="dxa" w:w="2409"/>
+          </w:tcPr>
+          <w:p>
+            <w:pPr>
+              <w:spacing w:after="0"/>
+            </w:pPr>
+            <w:r>
+              <w:rPr>
+                <w:sz w:val="18"/>
+              </w:rPr>
+              <w:t xml:space="preserve">Step costs + </w:t>
+            </w:r>
+            <w:r>
+              <w:rPr>
+                <w:rFonts w:ascii="Consolas" w:hAnsi="Consolas" w:eastAsia="Consolas"/>
+                <w:sz w:val="18"/>
+              </w:rPr>
+              <w:t>O(ΣNᵢ)</w:t>
+            </w:r>
+          </w:p>
+        </w:tc>
+        <w:tc>
+          <w:tcPr>
+            <w:tcW w:type="dxa" w:w="2409"/>
+          </w:tcPr>
+          <w:p>
+            <w:pPr>
+              <w:spacing w:after="0"/>
+            </w:pPr>
+            <w:r>
+              <w:rPr>
+                <w:sz w:val="18"/>
+              </w:rPr>
+              <w:t xml:space="preserve">Extra array storage </w:t>
+            </w:r>
+            <w:r>
+              <w:rPr>
+                <w:rFonts w:ascii="Consolas" w:hAnsi="Consolas" w:eastAsia="Consolas"/>
+                <w:sz w:val="18"/>
+              </w:rPr>
+              <w:t>O(max Nᵢ)</w:t>
+            </w:r>
+            <w:r>
+              <w:rPr>
+                <w:sz w:val="18"/>
+              </w:rPr>
+              <w:t xml:space="preserve">, excluding step internals/outputs; array-target copying adds </w:t>
+            </w:r>
+            <w:r>
+              <w:rPr>
+                <w:rFonts w:ascii="Consolas" w:hAnsi="Consolas" w:eastAsia="Consolas"/>
+                <w:sz w:val="18"/>
+              </w:rPr>
+              <w:t>O(y.size)</w:t>
+            </w:r>
+          </w:p>
+        </w:tc>
+      </w:tr>
+      <w:tr>
+        <w:tc>
+          <w:tcPr>
+            <w:tcW w:type="dxa" w:w="2409"/>
+          </w:tcPr>
+          <w:p>
+            <w:pPr>
+              <w:spacing w:after="0"/>
+            </w:pPr>
+            <w:r>
+              <w:rPr>
+                <w:rFonts w:ascii="Consolas" w:hAnsi="Consolas" w:eastAsia="Consolas"/>
+                <w:sz w:val="18"/>
+              </w:rPr>
+              <w:t>FeatureUnion</w:t>
+            </w:r>
+          </w:p>
+        </w:tc>
+        <w:tc>
+          <w:tcPr>
+            <w:tcW w:type="dxa" w:w="2409"/>
+          </w:tcPr>
+          <w:p>
+            <w:pPr>
+              <w:spacing w:after="0"/>
+            </w:pPr>
+            <w:r>
+              <w:rPr>
+                <w:sz w:val="18"/>
+              </w:rPr>
+              <w:t>Branch concatenation</w:t>
+            </w:r>
+          </w:p>
+        </w:tc>
+        <w:tc>
+          <w:tcPr>
+            <w:tcW w:type="dxa" w:w="2409"/>
+          </w:tcPr>
+          <w:p>
+            <w:pPr>
+              <w:spacing w:after="0"/>
+            </w:pPr>
+            <w:r>
+              <w:rPr>
+                <w:sz w:val="18"/>
+              </w:rPr>
+              <w:t xml:space="preserve">Branch costs + </w:t>
+            </w:r>
+            <w:r>
+              <w:rPr>
+                <w:rFonts w:ascii="Consolas" w:hAnsi="Consolas" w:eastAsia="Consolas"/>
+                <w:sz w:val="18"/>
+              </w:rPr>
+              <w:t>O(bN + M)</w:t>
+            </w:r>
+            <w:r>
+              <w:rPr>
+                <w:sz w:val="18"/>
+              </w:rPr>
+              <w:t xml:space="preserve"> for transformation</w:t>
+            </w:r>
+          </w:p>
+        </w:tc>
+        <w:tc>
+          <w:tcPr>
+            <w:tcW w:type="dxa" w:w="2409"/>
+          </w:tcPr>
+          <w:p>
+            <w:pPr>
+              <w:spacing w:after="0"/>
+            </w:pPr>
+            <w:r>
+              <w:rPr>
+                <w:sz w:val="18"/>
+              </w:rPr>
+              <w:t xml:space="preserve">Array storage </w:t>
+            </w:r>
+            <w:r>
+              <w:rPr>
+                <w:rFonts w:ascii="Consolas" w:hAnsi="Consolas" w:eastAsia="Consolas"/>
+                <w:sz w:val="18"/>
+              </w:rPr>
+              <w:t>O(N + M)</w:t>
+            </w:r>
+            <w:r>
+              <w:rPr>
+                <w:sz w:val="18"/>
+              </w:rPr>
+              <w:t>, excluding branch internals</w:t>
+            </w:r>
+          </w:p>
+        </w:tc>
+      </w:tr>
+      <w:tr>
+        <w:tc>
+          <w:tcPr>
+            <w:tcW w:type="dxa" w:w="2409"/>
+          </w:tcPr>
+          <w:p>
+            <w:pPr>
+              <w:spacing w:after="0"/>
+            </w:pPr>
+            <w:r>
+              <w:rPr>
+                <w:sz w:val="18"/>
+              </w:rPr>
+              <w:t>Numerical utilities</w:t>
+            </w:r>
+          </w:p>
+        </w:tc>
+        <w:tc>
+          <w:tcPr>
+            <w:tcW w:type="dxa" w:w="2409"/>
+          </w:tcPr>
+          <w:p>
+            <w:pPr>
+              <w:spacing w:after="0"/>
+            </w:pPr>
+            <w:r>
+              <w:rPr>
+                <w:sz w:val="18"/>
+              </w:rPr>
+              <w:t>Vectorised operations</w:t>
+            </w:r>
+          </w:p>
+        </w:tc>
+        <w:tc>
+          <w:tcPr>
+            <w:tcW w:type="dxa" w:w="2409"/>
+          </w:tcPr>
+          <w:p>
+            <w:pPr>
+              <w:spacing w:after="0"/>
+            </w:pPr>
+            <w:r>
+              <w:rPr>
+                <w:sz w:val="18"/>
+              </w:rPr>
+              <w:t xml:space="preserve">Elementwise </w:t>
+            </w:r>
+            <w:r>
+              <w:rPr>
+                <w:rFonts w:ascii="Consolas" w:hAnsi="Consolas" w:eastAsia="Consolas"/>
+                <w:sz w:val="18"/>
+              </w:rPr>
+              <w:t>O(N)</w:t>
+            </w:r>
+            <w:r>
+              <w:rPr>
+                <w:sz w:val="18"/>
+              </w:rPr>
+              <w:t xml:space="preserve">; reductions </w:t>
+            </w:r>
+            <w:r>
+              <w:rPr>
+                <w:rFonts w:ascii="Consolas" w:hAnsi="Consolas" w:eastAsia="Consolas"/>
+                <w:sz w:val="18"/>
+              </w:rPr>
+              <w:t>O(N + Q)</w:t>
+            </w:r>
+          </w:p>
+        </w:tc>
+        <w:tc>
+          <w:tcPr>
+            <w:tcW w:type="dxa" w:w="2409"/>
+          </w:tcPr>
+          <w:p>
+            <w:pPr>
+              <w:spacing w:after="0"/>
+            </w:pPr>
+            <w:r>
+              <w:rPr>
+                <w:sz w:val="18"/>
+              </w:rPr>
+              <w:t xml:space="preserve">Float64 outputs; space </w:t>
+            </w:r>
+            <w:r>
+              <w:rPr>
+                <w:rFonts w:ascii="Consolas" w:hAnsi="Consolas" w:eastAsia="Consolas"/>
+                <w:sz w:val="18"/>
+              </w:rPr>
+              <w:t>O(N + Q)</w:t>
+            </w:r>
+            <w:r>
+              <w:rPr>
+                <w:sz w:val="18"/>
+              </w:rPr>
+              <w:t xml:space="preserve"> for reductions; equal-shaped distance inputs</w:t>
+            </w:r>
+          </w:p>
+        </w:tc>
+      </w:tr>
+      <w:tr>
+        <w:tc>
+          <w:tcPr>
+            <w:tcW w:type="dxa" w:w="2409"/>
+          </w:tcPr>
+          <w:p>
+            <w:pPr>
+              <w:spacing w:after="0"/>
+            </w:pPr>
+            <w:r>
+              <w:rPr>
+                <w:rFonts w:ascii="Consolas" w:hAnsi="Consolas" w:eastAsia="Consolas"/>
+                <w:sz w:val="18"/>
+              </w:rPr>
+              <w:t>iter_batches</w:t>
+            </w:r>
+          </w:p>
+        </w:tc>
+        <w:tc>
+          <w:tcPr>
+            <w:tcW w:type="dxa" w:w="2409"/>
+          </w:tcPr>
+          <w:p>
+            <w:pPr>
+              <w:spacing w:after="0"/>
+            </w:pPr>
+            <w:r>
+              <w:rPr>
+                <w:sz w:val="18"/>
+              </w:rPr>
+              <w:t>Consecutive slices</w:t>
+            </w:r>
+          </w:p>
+        </w:tc>
+        <w:tc>
+          <w:tcPr>
+            <w:tcW w:type="dxa" w:w="2409"/>
+          </w:tcPr>
+          <w:p>
+            <w:pPr>
+              <w:spacing w:after="0"/>
+            </w:pPr>
+            <w:r>
+              <w:rPr>
+                <w:rFonts w:ascii="Consolas" w:hAnsi="Consolas" w:eastAsia="Consolas"/>
+                <w:sz w:val="18"/>
+              </w:rPr>
+              <w:t>O(B)</w:t>
+            </w:r>
+          </w:p>
+        </w:tc>
+        <w:tc>
+          <w:tcPr>
+            <w:tcW w:type="dxa" w:w="2409"/>
+          </w:tcPr>
+          <w:p>
+            <w:pPr>
+              <w:spacing w:after="0"/>
+            </w:pPr>
+            <w:r>
+              <w:rPr>
+                <w:sz w:val="18"/>
+              </w:rPr>
+              <w:t xml:space="preserve">Auxiliary space </w:t>
+            </w:r>
+            <w:r>
+              <w:rPr>
+                <w:rFonts w:ascii="Consolas" w:hAnsi="Consolas" w:eastAsia="Consolas"/>
+                <w:sz w:val="18"/>
+              </w:rPr>
+              <w:t>O(1)</w:t>
+            </w:r>
+            <w:r>
+              <w:rPr>
+                <w:sz w:val="18"/>
+              </w:rPr>
+              <w:t xml:space="preserve"> at fixed rank, excluding retained batches</w:t>
+            </w:r>
+          </w:p>
+        </w:tc>
+      </w:tr>
+      <w:tr>
+        <w:tc>
+          <w:tcPr>
+            <w:tcW w:type="dxa" w:w="2409"/>
+          </w:tcPr>
+          <w:p>
+            <w:pPr>
+              <w:spacing w:after="0"/>
+            </w:pPr>
+            <w:r>
+              <w:rPr>
+                <w:sz w:val="18"/>
+              </w:rPr>
+              <w:t>Benchmark harness</w:t>
+            </w:r>
+          </w:p>
+        </w:tc>
+        <w:tc>
+          <w:tcPr>
+            <w:tcW w:type="dxa" w:w="2409"/>
+          </w:tcPr>
+          <w:p>
+            <w:pPr>
+              <w:spacing w:after="0"/>
+            </w:pPr>
+            <w:r>
+              <w:rPr>
+                <w:sz w:val="18"/>
+              </w:rPr>
+              <w:t>Repeated measurements</w:t>
+            </w:r>
+          </w:p>
+        </w:tc>
+        <w:tc>
+          <w:tcPr>
+            <w:tcW w:type="dxa" w:w="2409"/>
+          </w:tcPr>
+          <w:p>
+            <w:pPr>
+              <w:spacing w:after="0"/>
+            </w:pPr>
+            <w:r>
+              <w:rPr>
+                <w:sz w:val="18"/>
+              </w:rPr>
+              <w:t>Proportional to calls and workload cost, plus checks</w:t>
+            </w:r>
+          </w:p>
+        </w:tc>
+        <w:tc>
+          <w:tcPr>
+            <w:tcW w:type="dxa" w:w="2409"/>
+          </w:tcPr>
+          <w:p>
+            <w:pPr>
+              <w:spacing w:after="0"/>
+            </w:pPr>
+            <w:r>
+              <w:rPr>
+                <w:sz w:val="18"/>
+              </w:rPr>
+              <w:t xml:space="preserve">Report storage </w:t>
+            </w:r>
+            <w:r>
+              <w:rPr>
+                <w:rFonts w:ascii="Consolas" w:hAnsi="Consolas" w:eastAsia="Consolas"/>
+                <w:sz w:val="18"/>
+              </w:rPr>
+              <w:t>O(CR)</w:t>
+            </w:r>
+            <w:r>
+              <w:rPr>
+                <w:sz w:val="18"/>
+              </w:rPr>
+              <w:t>, excluding workloads</w:t>
+            </w:r>
+          </w:p>
+        </w:tc>
+      </w:tr>
+    </w:tbl>
+    <w:p>
+      <w:pPr>
+        <w:spacing w:before="60"/>
+      </w:pPr>
+      <w:r>
+        <w:rPr>
+          <w:i/>
+          <w:sz w:val="18"/>
+        </w:rPr>
+        <w:t>Table 2. Techniques, complexity and contracts for pipelines, optimisation and utilities.</w:t>
+      </w:r>
+    </w:p>
+    <w:p>
       <w:pPr>
         <w:pStyle w:val="Heading1"/>
       </w:pPr>
@@ -1218,11 +2094,711 @@
       </w:r>
     </w:p>
     <w:p>
+      <w:r>
+        <w:rPr/>
+        <w:t xml:space="preserve">The complete suite passed </w:t>
+      </w:r>
+      <w:r>
+        <w:rPr>
+          <w:b/>
+        </w:rPr>
+        <w:t>478 tests</w:t>
+      </w:r>
+      <w:r>
+        <w:rPr/>
+        <w:t>, including parameterised cases. Tests cover analytic derivatives across all schemes, rectangular Jacobians, invalid arguments/outputs, ineffective steps and overflow; composition order, target forwarding, prediction, nesting, changed widths, copy isolation and failed refits; and utility axes, empty arrays, non-contiguous inputs, NaNs, infinities, extreme values, large signed/unsigned integers and batch views. Four harness tests cover execution counts/order, correctness failure, configuration validation and mocked-clock arithmetic without performance thresholds.</w:t>
+      </w:r>
+    </w:p>
+    <w:p>
+      <w:r>
+        <w:rPr/>
+        <w:t>Finite differences remain sensitive to step size and roundoff; callables must not mutate evaluation inputs. Results remain limited by float64 range. Object-array copies are shallow; steps control dtype, missing-value and feature policies. Compatibility with actual scalers, imputers and encoders requires integration testing.</w:t>
+      </w:r>
+    </w:p>
+    <w:p>
       <w:pPr>
         <w:pStyle w:val="Heading1"/>
       </w:pPr>
       <w:r>
         <w:t>3. Benchmark results</w:t>
+      </w:r>
+    </w:p>
+    <w:p>
+      <w:r>
+        <w:rPr/>
+        <w:t xml:space="preserve">Benchmarks exclude preparation and correctness checks, including batch contents/order and input preservation, from timing. Warmups precede repeated calls measured with </w:t>
+      </w:r>
+      <w:r>
+        <w:rPr>
+          <w:rFonts w:ascii="Consolas" w:hAnsi="Consolas" w:eastAsia="Consolas"/>
+        </w:rPr>
+        <w:t>perf_counter_ns</w:t>
+      </w:r>
+      <w:r>
+        <w:rPr/>
+        <w:t xml:space="preserve">; elapsed nanoseconds become seconds per call. Comparison order alternates, and raw samples plus minimum, median and maximum timings are retained. </w:t>
+      </w:r>
+      <w:r>
+        <w:rPr>
+          <w:rFonts w:ascii="Consolas" w:hAnsi="Consolas" w:eastAsia="Consolas"/>
+        </w:rPr>
+        <w:t>benchmark/results.json</w:t>
+      </w:r>
+      <w:r>
+        <w:rPr/>
+        <w:t xml:space="preserve"> contains a recorded and verified benchmark snapshot: 13 workloads, seed 2026, one warmup, five repeats and three calls per sample. It records shapes, tolerances, configuration and environment metadata; all six source hashes match.</w:t>
+      </w:r>
+    </w:p>
+    <w:tbl>
+      <w:tblPr>
+        <w:tblStyle w:val="TableGrid"/>
+        <w:tblW w:type="auto" w:w="0"/>
+        <w:jc w:val="center"/>
+        <w:tblLook w:firstColumn="1" w:firstRow="1" w:lastColumn="0" w:lastRow="0" w:noHBand="0" w:noVBand="1" w:val="04A0"/>
+        <w:tblBorders>
+          <w:top w:val="single" w:sz="4" w:color="808080"/>
+          <w:left w:val="single" w:sz="4" w:color="808080"/>
+          <w:bottom w:val="single" w:sz="4" w:color="808080"/>
+          <w:right w:val="single" w:sz="4" w:color="808080"/>
+          <w:insideH w:val="single" w:sz="4" w:color="808080"/>
+          <w:insideV w:val="single" w:sz="4" w:color="808080"/>
+        </w:tblBorders>
+      </w:tblPr>
+      <w:tblGrid>
+        <w:gridCol w:w="1928"/>
+        <w:gridCol w:w="1928"/>
+        <w:gridCol w:w="1928"/>
+        <w:gridCol w:w="1928"/>
+        <w:gridCol w:w="1928"/>
+      </w:tblGrid>
+      <w:tr>
+        <w:tc>
+          <w:tcPr>
+            <w:tcW w:type="dxa" w:w="1928"/>
+            <w:shd w:val="clear" w:color="auto" w:fill="D9E2F3"/>
+          </w:tcPr>
+          <w:p>
+            <w:pPr>
+              <w:spacing w:after="0"/>
+            </w:pPr>
+            <w:r>
+              <w:rPr>
+                <w:b/>
+                <w:sz w:val="18"/>
+              </w:rPr>
+              <w:t>Workload</w:t>
+            </w:r>
+          </w:p>
+        </w:tc>
+        <w:tc>
+          <w:tcPr>
+            <w:tcW w:type="dxa" w:w="1928"/>
+            <w:shd w:val="clear" w:color="auto" w:fill="D9E2F3"/>
+          </w:tcPr>
+          <w:p>
+            <w:pPr>
+              <w:spacing w:after="0"/>
+            </w:pPr>
+            <w:r>
+              <w:rPr>
+                <w:b/>
+                <w:sz w:val="18"/>
+              </w:rPr>
+              <w:t>Shape</w:t>
+            </w:r>
+          </w:p>
+        </w:tc>
+        <w:tc>
+          <w:tcPr>
+            <w:tcW w:type="dxa" w:w="1928"/>
+            <w:shd w:val="clear" w:color="auto" w:fill="D9E2F3"/>
+          </w:tcPr>
+          <w:p>
+            <w:pPr>
+              <w:spacing w:after="0"/>
+              <w:jc w:val="right"/>
+            </w:pPr>
+            <w:r>
+              <w:rPr>
+                <w:b/>
+                <w:sz w:val="18"/>
+              </w:rPr>
+              <w:t>Python loop (ms)</w:t>
+            </w:r>
+          </w:p>
+        </w:tc>
+        <w:tc>
+          <w:tcPr>
+            <w:tcW w:type="dxa" w:w="1928"/>
+            <w:shd w:val="clear" w:color="auto" w:fill="D9E2F3"/>
+          </w:tcPr>
+          <w:p>
+            <w:pPr>
+              <w:spacing w:after="0"/>
+              <w:jc w:val="right"/>
+            </w:pPr>
+            <w:r>
+              <w:rPr>
+                <w:b/>
+                <w:sz w:val="18"/>
+              </w:rPr>
+              <w:t>NumPy (ms)</w:t>
+            </w:r>
+          </w:p>
+        </w:tc>
+        <w:tc>
+          <w:tcPr>
+            <w:tcW w:type="dxa" w:w="1928"/>
+            <w:shd w:val="clear" w:color="auto" w:fill="D9E2F3"/>
+          </w:tcPr>
+          <w:p>
+            <w:pPr>
+              <w:spacing w:after="0"/>
+              <w:jc w:val="right"/>
+            </w:pPr>
+            <w:r>
+              <w:rPr>
+                <w:b/>
+                <w:sz w:val="18"/>
+              </w:rPr>
+              <w:t>Speed-up</w:t>
+            </w:r>
+          </w:p>
+        </w:tc>
+      </w:tr>
+      <w:tr>
+        <w:tc>
+          <w:tcPr>
+            <w:tcW w:type="dxa" w:w="1928"/>
+          </w:tcPr>
+          <w:p>
+            <w:pPr>
+              <w:spacing w:after="0"/>
+            </w:pPr>
+            <w:r>
+              <w:rPr>
+                <w:rFonts w:ascii="Consolas" w:hAnsi="Consolas" w:eastAsia="Consolas"/>
+                <w:sz w:val="18"/>
+              </w:rPr>
+              <w:t>utils.sigmoid</w:t>
+            </w:r>
+          </w:p>
+        </w:tc>
+        <w:tc>
+          <w:tcPr>
+            <w:tcW w:type="dxa" w:w="1928"/>
+          </w:tcPr>
+          <w:p>
+            <w:pPr>
+              <w:spacing w:after="0"/>
+            </w:pPr>
+            <w:r>
+              <w:rPr>
+                <w:sz w:val="18"/>
+              </w:rPr>
+              <w:t>2000×16</w:t>
+            </w:r>
+          </w:p>
+        </w:tc>
+        <w:tc>
+          <w:tcPr>
+            <w:tcW w:type="dxa" w:w="1928"/>
+          </w:tcPr>
+          <w:p>
+            <w:pPr>
+              <w:spacing w:after="0"/>
+              <w:jc w:val="right"/>
+            </w:pPr>
+            <w:r>
+              <w:rPr>
+                <w:sz w:val="18"/>
+              </w:rPr>
+              <w:t>5.003</w:t>
+            </w:r>
+          </w:p>
+        </w:tc>
+        <w:tc>
+          <w:tcPr>
+            <w:tcW w:type="dxa" w:w="1928"/>
+          </w:tcPr>
+          <w:p>
+            <w:pPr>
+              <w:spacing w:after="0"/>
+              <w:jc w:val="right"/>
+            </w:pPr>
+            <w:r>
+              <w:rPr>
+                <w:sz w:val="18"/>
+              </w:rPr>
+              <w:t>0.625</w:t>
+            </w:r>
+          </w:p>
+        </w:tc>
+        <w:tc>
+          <w:tcPr>
+            <w:tcW w:type="dxa" w:w="1928"/>
+          </w:tcPr>
+          <w:p>
+            <w:pPr>
+              <w:spacing w:after="0"/>
+              <w:jc w:val="right"/>
+            </w:pPr>
+            <w:r>
+              <w:rPr>
+                <w:sz w:val="18"/>
+              </w:rPr>
+              <w:t>8.0×</w:t>
+            </w:r>
+          </w:p>
+        </w:tc>
+      </w:tr>
+      <w:tr>
+        <w:tc>
+          <w:tcPr>
+            <w:tcW w:type="dxa" w:w="1928"/>
+          </w:tcPr>
+          <w:p>
+            <w:pPr>
+              <w:spacing w:after="0"/>
+            </w:pPr>
+            <w:r>
+              <w:rPr>
+                <w:rFonts w:ascii="Consolas" w:hAnsi="Consolas" w:eastAsia="Consolas"/>
+                <w:sz w:val="18"/>
+              </w:rPr>
+              <w:t>utils.relu</w:t>
+            </w:r>
+          </w:p>
+        </w:tc>
+        <w:tc>
+          <w:tcPr>
+            <w:tcW w:type="dxa" w:w="1928"/>
+          </w:tcPr>
+          <w:p>
+            <w:pPr>
+              <w:spacing w:after="0"/>
+            </w:pPr>
+            <w:r>
+              <w:rPr>
+                <w:sz w:val="18"/>
+              </w:rPr>
+              <w:t>2000×16</w:t>
+            </w:r>
+          </w:p>
+        </w:tc>
+        <w:tc>
+          <w:tcPr>
+            <w:tcW w:type="dxa" w:w="1928"/>
+          </w:tcPr>
+          <w:p>
+            <w:pPr>
+              <w:spacing w:after="0"/>
+              <w:jc w:val="right"/>
+            </w:pPr>
+            <w:r>
+              <w:rPr>
+                <w:sz w:val="18"/>
+              </w:rPr>
+              <w:t>3.054</w:t>
+            </w:r>
+          </w:p>
+        </w:tc>
+        <w:tc>
+          <w:tcPr>
+            <w:tcW w:type="dxa" w:w="1928"/>
+          </w:tcPr>
+          <w:p>
+            <w:pPr>
+              <w:spacing w:after="0"/>
+              <w:jc w:val="right"/>
+            </w:pPr>
+            <w:r>
+              <w:rPr>
+                <w:sz w:val="18"/>
+              </w:rPr>
+              <w:t>0.018</w:t>
+            </w:r>
+          </w:p>
+        </w:tc>
+        <w:tc>
+          <w:tcPr>
+            <w:tcW w:type="dxa" w:w="1928"/>
+          </w:tcPr>
+          <w:p>
+            <w:pPr>
+              <w:spacing w:after="0"/>
+              <w:jc w:val="right"/>
+            </w:pPr>
+            <w:r>
+              <w:rPr>
+                <w:sz w:val="18"/>
+              </w:rPr>
+              <w:t>166.3×</w:t>
+            </w:r>
+          </w:p>
+        </w:tc>
+      </w:tr>
+      <w:tr>
+        <w:tc>
+          <w:tcPr>
+            <w:tcW w:type="dxa" w:w="1928"/>
+          </w:tcPr>
+          <w:p>
+            <w:pPr>
+              <w:spacing w:after="0"/>
+            </w:pPr>
+            <w:r>
+              <w:rPr>
+                <w:rFonts w:ascii="Consolas" w:hAnsi="Consolas" w:eastAsia="Consolas"/>
+                <w:sz w:val="18"/>
+              </w:rPr>
+              <w:t>utils.softmax</w:t>
+            </w:r>
+          </w:p>
+        </w:tc>
+        <w:tc>
+          <w:tcPr>
+            <w:tcW w:type="dxa" w:w="1928"/>
+          </w:tcPr>
+          <w:p>
+            <w:pPr>
+              <w:spacing w:after="0"/>
+            </w:pPr>
+            <w:r>
+              <w:rPr>
+                <w:sz w:val="18"/>
+              </w:rPr>
+              <w:t>2000×16</w:t>
+            </w:r>
+          </w:p>
+        </w:tc>
+        <w:tc>
+          <w:tcPr>
+            <w:tcW w:type="dxa" w:w="1928"/>
+          </w:tcPr>
+          <w:p>
+            <w:pPr>
+              <w:spacing w:after="0"/>
+              <w:jc w:val="right"/>
+            </w:pPr>
+            <w:r>
+              <w:rPr>
+                <w:sz w:val="18"/>
+              </w:rPr>
+              <w:t>8.227</w:t>
+            </w:r>
+          </w:p>
+        </w:tc>
+        <w:tc>
+          <w:tcPr>
+            <w:tcW w:type="dxa" w:w="1928"/>
+          </w:tcPr>
+          <w:p>
+            <w:pPr>
+              <w:spacing w:after="0"/>
+              <w:jc w:val="right"/>
+            </w:pPr>
+            <w:r>
+              <w:rPr>
+                <w:sz w:val="18"/>
+              </w:rPr>
+              <w:t>0.205</w:t>
+            </w:r>
+          </w:p>
+        </w:tc>
+        <w:tc>
+          <w:tcPr>
+            <w:tcW w:type="dxa" w:w="1928"/>
+          </w:tcPr>
+          <w:p>
+            <w:pPr>
+              <w:spacing w:after="0"/>
+              <w:jc w:val="right"/>
+            </w:pPr>
+            <w:r>
+              <w:rPr>
+                <w:sz w:val="18"/>
+              </w:rPr>
+              <w:t>40.1×</w:t>
+            </w:r>
+          </w:p>
+        </w:tc>
+      </w:tr>
+      <w:tr>
+        <w:tc>
+          <w:tcPr>
+            <w:tcW w:type="dxa" w:w="1928"/>
+          </w:tcPr>
+          <w:p>
+            <w:pPr>
+              <w:spacing w:after="0"/>
+            </w:pPr>
+            <w:r>
+              <w:rPr>
+                <w:rFonts w:ascii="Consolas" w:hAnsi="Consolas" w:eastAsia="Consolas"/>
+                <w:sz w:val="18"/>
+              </w:rPr>
+              <w:t>utils.logsumexp</w:t>
+            </w:r>
+          </w:p>
+        </w:tc>
+        <w:tc>
+          <w:tcPr>
+            <w:tcW w:type="dxa" w:w="1928"/>
+          </w:tcPr>
+          <w:p>
+            <w:pPr>
+              <w:spacing w:after="0"/>
+            </w:pPr>
+            <w:r>
+              <w:rPr>
+                <w:sz w:val="18"/>
+              </w:rPr>
+              <w:t>2000×16</w:t>
+            </w:r>
+          </w:p>
+        </w:tc>
+        <w:tc>
+          <w:tcPr>
+            <w:tcW w:type="dxa" w:w="1928"/>
+          </w:tcPr>
+          <w:p>
+            <w:pPr>
+              <w:spacing w:after="0"/>
+              <w:jc w:val="right"/>
+            </w:pPr>
+            <w:r>
+              <w:rPr>
+                <w:sz w:val="18"/>
+              </w:rPr>
+              <w:t>6.342</w:t>
+            </w:r>
+          </w:p>
+        </w:tc>
+        <w:tc>
+          <w:tcPr>
+            <w:tcW w:type="dxa" w:w="1928"/>
+          </w:tcPr>
+          <w:p>
+            <w:pPr>
+              <w:spacing w:after="0"/>
+              <w:jc w:val="right"/>
+            </w:pPr>
+            <w:r>
+              <w:rPr>
+                <w:sz w:val="18"/>
+              </w:rPr>
+              <w:t>0.217</w:t>
+            </w:r>
+          </w:p>
+        </w:tc>
+        <w:tc>
+          <w:tcPr>
+            <w:tcW w:type="dxa" w:w="1928"/>
+          </w:tcPr>
+          <w:p>
+            <w:pPr>
+              <w:spacing w:after="0"/>
+              <w:jc w:val="right"/>
+            </w:pPr>
+            <w:r>
+              <w:rPr>
+                <w:sz w:val="18"/>
+              </w:rPr>
+              <w:t>29.3×</w:t>
+            </w:r>
+          </w:p>
+        </w:tc>
+      </w:tr>
+      <w:tr>
+        <w:tc>
+          <w:tcPr>
+            <w:tcW w:type="dxa" w:w="1928"/>
+          </w:tcPr>
+          <w:p>
+            <w:pPr>
+              <w:spacing w:after="0"/>
+            </w:pPr>
+            <w:r>
+              <w:rPr>
+                <w:rFonts w:ascii="Consolas" w:hAnsi="Consolas" w:eastAsia="Consolas"/>
+                <w:sz w:val="18"/>
+              </w:rPr>
+              <w:t>utils.euclidean_distance</w:t>
+            </w:r>
+          </w:p>
+        </w:tc>
+        <w:tc>
+          <w:tcPr>
+            <w:tcW w:type="dxa" w:w="1928"/>
+          </w:tcPr>
+          <w:p>
+            <w:pPr>
+              <w:spacing w:after="0"/>
+            </w:pPr>
+            <w:r>
+              <w:rPr>
+                <w:sz w:val="18"/>
+              </w:rPr>
+              <w:t>2000×16</w:t>
+            </w:r>
+          </w:p>
+        </w:tc>
+        <w:tc>
+          <w:tcPr>
+            <w:tcW w:type="dxa" w:w="1928"/>
+          </w:tcPr>
+          <w:p>
+            <w:pPr>
+              <w:spacing w:after="0"/>
+              <w:jc w:val="right"/>
+            </w:pPr>
+            <w:r>
+              <w:rPr>
+                <w:sz w:val="18"/>
+              </w:rPr>
+              <w:t>4.676</w:t>
+            </w:r>
+          </w:p>
+        </w:tc>
+        <w:tc>
+          <w:tcPr>
+            <w:tcW w:type="dxa" w:w="1928"/>
+          </w:tcPr>
+          <w:p>
+            <w:pPr>
+              <w:spacing w:after="0"/>
+              <w:jc w:val="right"/>
+            </w:pPr>
+            <w:r>
+              <w:rPr>
+                <w:sz w:val="18"/>
+              </w:rPr>
+              <w:t>0.454</w:t>
+            </w:r>
+          </w:p>
+        </w:tc>
+        <w:tc>
+          <w:tcPr>
+            <w:tcW w:type="dxa" w:w="1928"/>
+          </w:tcPr>
+          <w:p>
+            <w:pPr>
+              <w:spacing w:after="0"/>
+              <w:jc w:val="right"/>
+            </w:pPr>
+            <w:r>
+              <w:rPr>
+                <w:sz w:val="18"/>
+              </w:rPr>
+              <w:t>10.3×</w:t>
+            </w:r>
+          </w:p>
+        </w:tc>
+      </w:tr>
+      <w:tr>
+        <w:tc>
+          <w:tcPr>
+            <w:tcW w:type="dxa" w:w="1928"/>
+          </w:tcPr>
+          <w:p>
+            <w:pPr>
+              <w:spacing w:after="0"/>
+            </w:pPr>
+            <w:r>
+              <w:rPr>
+                <w:rFonts w:ascii="Consolas" w:hAnsi="Consolas" w:eastAsia="Consolas"/>
+                <w:sz w:val="18"/>
+              </w:rPr>
+              <w:t>utils.manhattan_distance</w:t>
+            </w:r>
+          </w:p>
+        </w:tc>
+        <w:tc>
+          <w:tcPr>
+            <w:tcW w:type="dxa" w:w="1928"/>
+          </w:tcPr>
+          <w:p>
+            <w:pPr>
+              <w:spacing w:after="0"/>
+            </w:pPr>
+            <w:r>
+              <w:rPr>
+                <w:sz w:val="18"/>
+              </w:rPr>
+              <w:t>2000×16</w:t>
+            </w:r>
+          </w:p>
+        </w:tc>
+        <w:tc>
+          <w:tcPr>
+            <w:tcW w:type="dxa" w:w="1928"/>
+          </w:tcPr>
+          <w:p>
+            <w:pPr>
+              <w:spacing w:after="0"/>
+              <w:jc w:val="right"/>
+            </w:pPr>
+            <w:r>
+              <w:rPr>
+                <w:sz w:val="18"/>
+              </w:rPr>
+              <w:t>5.131</w:t>
+            </w:r>
+          </w:p>
+        </w:tc>
+        <w:tc>
+          <w:tcPr>
+            <w:tcW w:type="dxa" w:w="1928"/>
+          </w:tcPr>
+          <w:p>
+            <w:pPr>
+              <w:spacing w:after="0"/>
+              <w:jc w:val="right"/>
+            </w:pPr>
+            <w:r>
+              <w:rPr>
+                <w:sz w:val="18"/>
+              </w:rPr>
+              <w:t>0.047</w:t>
+            </w:r>
+          </w:p>
+        </w:tc>
+        <w:tc>
+          <w:tcPr>
+            <w:tcW w:type="dxa" w:w="1928"/>
+          </w:tcPr>
+          <w:p>
+            <w:pPr>
+              <w:spacing w:after="0"/>
+              <w:jc w:val="right"/>
+            </w:pPr>
+            <w:r>
+              <w:rPr>
+                <w:sz w:val="18"/>
+              </w:rPr>
+              <w:t>109.8×</w:t>
+            </w:r>
+          </w:p>
+        </w:tc>
+      </w:tr>
+    </w:tbl>
+    <w:p>
+      <w:pPr>
+        <w:spacing w:before="60"/>
+      </w:pPr>
+      <w:r>
+        <w:rPr>
+          <w:i/>
+          <w:sz w:val="18"/>
+        </w:rPr>
+        <w:t>Table 3. Median milliseconds per call from benchmark/results.json (Python 3.14.7, NumPy 2.5.3, macOS arm64, 8 CPUs; seed 2026, 5 repeats × 3 calls). Ratios apply to this environment only.</w:t>
+      </w:r>
+    </w:p>
+    <w:p>
+      <w:r>
+        <w:rPr/>
+        <w:t>Current benchmarks cover utilities, differentiation and composition only. Utilities use loop comparisons; derivatives use untimed analytic checks. Composition uses direct utility comparisons and adapters that learn no parameters, measuring overhead rather than preprocessing training. Timings concern one environment and finite float64 workloads. Preprocessing, sorting/searching, ranking, statistics, metrics and I/O benchmarks await merged modules, integrated tests and the required notebook demonstration.</w:t>
       </w:r>
     </w:p>
     <w:p>
@@ -1575,7 +3151,7 @@
           <w:i/>
           <w:sz w:val="18"/>
         </w:rPr>
-        <w:t>Table 2. Contribution summary; evidence is recorded in CONTRIBUTIONS.md.</w:t>
+        <w:t>Table 4. Contribution summary; evidence is recorded in CONTRIBUTIONS.md.</w:t>
       </w:r>
     </w:p>
     <w:p>

</xml_diff>

<commit_message>
Finalize integration docs, report, and Quickstart
</commit_message>
<xml_diff>
--- a/report/NumCompute-report.docx
+++ b/report/NumCompute-report.docx
@@ -1,6 +1,6 @@
 
 <file path=word/document.xml><?xml version="1.0" encoding="utf-8"?>
-<w:document xmlns:wpc="http://schemas.microsoft.com/office/word/2010/wordprocessingCanvas" xmlns:mo="http://schemas.microsoft.com/office/mac/office/2008/main" xmlns:mc="http://schemas.openxmlformats.org/markup-compatibility/2006" xmlns:mv="urn:schemas-microsoft-com:mac:vml" xmlns:o="urn:schemas-microsoft-com:office:office" xmlns:r="http://schemas.openxmlformats.org/officeDocument/2006/relationships" xmlns:m="http://schemas.openxmlformats.org/officeDocument/2006/math" xmlns:v="urn:schemas-microsoft-com:vml" xmlns:wp14="http://schemas.microsoft.com/office/word/2010/wordprocessingDrawing" xmlns:wp="http://schemas.openxmlformats.org/drawingml/2006/wordprocessingDrawing" xmlns:w10="urn:schemas-microsoft-com:office:word" xmlns:w="http://schemas.openxmlformats.org/wordprocessingml/2006/main" xmlns:w14="http://schemas.microsoft.com/office/word/2010/wordml" xmlns:wpg="http://schemas.microsoft.com/office/word/2010/wordprocessingGroup" xmlns:wpi="http://schemas.microsoft.com/office/word/2010/wordprocessingInk" xmlns:wne="http://schemas.microsoft.com/office/word/2006/wordml" xmlns:wps="http://schemas.microsoft.com/office/word/2010/wordprocessingShape" mc:Ignorable="w14 wp14">
+<w:document xmlns:mc="http://schemas.openxmlformats.org/markup-compatibility/2006" xmlns:w="http://schemas.openxmlformats.org/wordprocessingml/2006/main" xmlns:w14="http://schemas.microsoft.com/office/word/2010/wordml" xmlns:wp14="http://schemas.microsoft.com/office/word/2010/wordprocessingDrawing" mc:Ignorable="w14 wp14">
   <w:body>
     <w:p>
       <w:pPr>
@@ -1088,6 +1088,18 @@
       </w:r>
     </w:p>
     <w:p>
+      <w:r>
+        <w:rPr/>
+        <w:t>stats.py provides axis-aware mean, median, variance, standard deviation, minimum/maximum, histograms and quantiles, plus mergeable Welford/Chan RunningStats. Reductions support axis and tuple axes, keepdims and propagate/omit/raise NaN policies. Mean returns float64; variance divides the squared-deviation sum by count minus ddof and returns NaN with a RuntimeWarning when a slice has no more valid observations than ddof.</w:t>
+      </w:r>
+    </w:p>
+    <w:p>
+      <w:r>
+        <w:rPr/>
+        <w:t>metrics.py implements confusion matrix (true labels in rows, predictions in columns), accuracy, precision, recall, F1, mean squared error, ROC curves and AUC. Classification metrics support explicit labels and documented binary, micro, macro and weighted averages where applicable. Two current behavior decisions are recorded in API_CONTRACT.md: integer ROC thresholds may use object dtype to preserve exact values, and weighted F1 with zero_division=np.nan may propagate NaN for an included zero-support class.</w:t>
+      </w:r>
+    </w:p>
+    <w:p>
       <w:pPr>
         <w:pStyle w:val="Heading2"/>
       </w:pPr>
@@ -1178,111 +1190,111 @@
         <w:rPr>
           <w:rFonts w:ascii="Consolas" w:hAnsi="Consolas" w:eastAsia="Consolas"/>
         </w:rPr>
-        <w:t>sigmoid</w:t>
+        <w:t>sigmoid uses sign-dependent evaluation; relu applies an elementwise maximum. softmax and logsumexp subtract maxima before exponentiation; the latter handles empty and non-finite slices. Python-integer temporaries preserve integer differences, with a rounding-residual correction in logsumexp. euclidean_distance uses np.hypot.reduce to avoid unnecessary overflow; manhattan_distance sums absolute differences. Two integer distance inputs are subtracted before float conversion, avoiding wraparound and lost gaps. iter_batches yields ordered views whose modification can affect the source. The duplicate top_k_indices was removed; integrated sort_search.topk is the project's single top-k implementation.</w:t>
       </w:r>
       <w:r>
         <w:rPr/>
-        <w:t xml:space="preserve"> uses sign-dependent evaluation; </w:t>
+        <w:t xml:space="preserve"/>
       </w:r>
       <w:r>
         <w:rPr>
           <w:rFonts w:ascii="Consolas" w:hAnsi="Consolas" w:eastAsia="Consolas"/>
         </w:rPr>
-        <w:t>relu</w:t>
+        <w:t/>
       </w:r>
       <w:r>
         <w:rPr/>
-        <w:t xml:space="preserve"> applies an elementwise maximum. </w:t>
+        <w:t xml:space="preserve"/>
       </w:r>
       <w:r>
         <w:rPr>
           <w:rFonts w:ascii="Consolas" w:hAnsi="Consolas" w:eastAsia="Consolas"/>
         </w:rPr>
-        <w:t>softmax</w:t>
+        <w:t/>
       </w:r>
       <w:r>
         <w:rPr/>
-        <w:t xml:space="preserve"> and </w:t>
+        <w:t xml:space="preserve"/>
       </w:r>
       <w:r>
         <w:rPr>
           <w:rFonts w:ascii="Consolas" w:hAnsi="Consolas" w:eastAsia="Consolas"/>
         </w:rPr>
-        <w:t>logsumexp</w:t>
+        <w:t/>
       </w:r>
       <w:r>
         <w:rPr/>
-        <w:t xml:space="preserve"> subtract maxima before exponentiation; the latter handles empty and non-finite slices. Python-integer temporaries preserve integer differences, with a rounding-residual correction in </w:t>
+        <w:t xml:space="preserve"/>
       </w:r>
       <w:r>
         <w:rPr>
           <w:rFonts w:ascii="Consolas" w:hAnsi="Consolas" w:eastAsia="Consolas"/>
         </w:rPr>
-        <w:t>logsumexp</w:t>
+        <w:t/>
       </w:r>
       <w:r>
         <w:rPr/>
-        <w:t xml:space="preserve">. </w:t>
+        <w:t xml:space="preserve"/>
       </w:r>
       <w:r>
         <w:rPr>
           <w:rFonts w:ascii="Consolas" w:hAnsi="Consolas" w:eastAsia="Consolas"/>
         </w:rPr>
-        <w:t>euclidean_distance</w:t>
+        <w:t/>
       </w:r>
       <w:r>
         <w:rPr/>
-        <w:t xml:space="preserve"> uses </w:t>
+        <w:t xml:space="preserve"/>
       </w:r>
       <w:r>
         <w:rPr>
           <w:rFonts w:ascii="Consolas" w:hAnsi="Consolas" w:eastAsia="Consolas"/>
         </w:rPr>
-        <w:t>np.hypot.reduce</w:t>
+        <w:t/>
       </w:r>
       <w:r>
         <w:rPr/>
-        <w:t xml:space="preserve"> to avoid unnecessary overflow; </w:t>
+        <w:t xml:space="preserve"/>
       </w:r>
       <w:r>
         <w:rPr>
           <w:rFonts w:ascii="Consolas" w:hAnsi="Consolas" w:eastAsia="Consolas"/>
         </w:rPr>
-        <w:t>manhattan_distance</w:t>
+        <w:t/>
       </w:r>
       <w:r>
         <w:rPr/>
-        <w:t xml:space="preserve"> sums absolute differences. Two integer distance inputs are subtracted before float conversion, avoiding wraparound and lost gaps. </w:t>
+        <w:t xml:space="preserve"/>
       </w:r>
       <w:r>
         <w:rPr>
           <w:rFonts w:ascii="Consolas" w:hAnsi="Consolas" w:eastAsia="Consolas"/>
         </w:rPr>
-        <w:t>iter_batches</w:t>
+        <w:t/>
       </w:r>
       <w:r>
         <w:rPr/>
-        <w:t xml:space="preserve"> yields ordered views whose modification can affect the source. The duplicate </w:t>
+        <w:t xml:space="preserve"/>
       </w:r>
       <w:r>
         <w:rPr>
           <w:rFonts w:ascii="Consolas" w:hAnsi="Consolas" w:eastAsia="Consolas"/>
         </w:rPr>
-        <w:t>top_k_indices</w:t>
+        <w:t/>
       </w:r>
       <w:r>
         <w:rPr/>
-        <w:t xml:space="preserve"> was deliberately removed; the designated single implementation, </w:t>
+        <w:t xml:space="preserve"/>
       </w:r>
       <w:r>
         <w:rPr>
           <w:rFonts w:ascii="Consolas" w:hAnsi="Consolas" w:eastAsia="Consolas"/>
         </w:rPr>
-        <w:t>sort_search.topk</w:t>
+        <w:t/>
       </w:r>
       <w:r>
         <w:rPr/>
-        <w:t>, awaits integration.</w:t>
+        <w:t/>
       </w:r>
     </w:p>
     <w:p>
@@ -2086,6 +2098,18 @@
       </w:r>
     </w:p>
     <w:p>
+      <w:r>
+        <w:rPr/>
+        <w:t>Statistics and metrics tests cover axes and output shapes, NaN policies and all-NaN slices, ddof validation and exhausted degrees of freedom, streaming updates and merges, histogram/quantile behavior, confusion-matrix label order, undefined precision/recall/F1, multiclass averaging, ROC score ties and invalid inputs. Regression tests also cover mixed signed/unsigned labels, large integer score ordering, small benchmark row counts and subnormal variance/std results.</w:t>
+      </w:r>
+    </w:p>
+    <w:p>
+      <w:r>
+        <w:rPr/>
+        <w:t>The default and supported four-row benchmark workloads each passed all 20 correctness checks.</w:t>
+      </w:r>
+    </w:p>
+    <w:p>
       <w:pPr>
         <w:pStyle w:val="Heading2"/>
       </w:pPr>
@@ -2096,17 +2120,17 @@
     <w:p>
       <w:r>
         <w:rPr/>
-        <w:t xml:space="preserve">The complete suite passed </w:t>
+        <w:t xml:space="preserve">The complete integrated suite passed 642 tests, including parameterised cases; four warnings report the optional PyYAML dependency is unavailable. Tests cover analytic derivatives across all schemes, rectangular Jacobians, invalid arguments/outputs, ineffective steps and overflow; composition order, target forwarding, prediction, nesting, changed widths, copy isolation and failed refits; and utility axes, empty arrays, non-contiguous inputs, NaNs, infinities, extreme values, large signed/unsigned integers and batch views. Four harness tests cover execution counts/order, correctness failure, configuration validation and mocked-clock arithmetic without performance thresholds.</w:t>
       </w:r>
       <w:r>
         <w:rPr>
           <w:b/>
         </w:rPr>
-        <w:t>478 tests</w:t>
+        <w:t/>
       </w:r>
       <w:r>
         <w:rPr/>
-        <w:t>, including parameterised cases. Tests cover analytic derivatives across all schemes, rectangular Jacobians, invalid arguments/outputs, ineffective steps and overflow; composition order, target forwarding, prediction, nesting, changed widths, copy isolation and failed refits; and utility axes, empty arrays, non-contiguous inputs, NaNs, infinities, extreme values, large signed/unsigned integers and batch views. Four harness tests cover execution counts/order, correctness failure, configuration validation and mocked-clock arithmetic without performance thresholds.</w:t>
+        <w:t/>
       </w:r>
     </w:p>
     <w:p>
@@ -2126,27 +2150,27 @@
     <w:p>
       <w:r>
         <w:rPr/>
-        <w:t xml:space="preserve">Benchmarks exclude preparation and correctness checks, including batch contents/order and input preservation, from timing. Warmups precede repeated calls measured with </w:t>
+        <w:t xml:space="preserve">Benchmarks exclude preparation and correctness checks, including batch contents/order and input preservation, from timing. Warmups precede repeated calls measured with perf_counter_ns; elapsed nanoseconds become seconds per call. Comparison order alternates, and raw samples plus minimum, median and maximum timings are retained. benchmark/results.json contains a recorded and verified benchmark snapshot: 20 workloads, seed 2026, one warmup, five repeats and three calls per sample. It records shapes, tolerances, configuration and environment metadata; all eight recorded source hashes match.</w:t>
       </w:r>
       <w:r>
         <w:rPr>
           <w:rFonts w:ascii="Consolas" w:hAnsi="Consolas" w:eastAsia="Consolas"/>
         </w:rPr>
-        <w:t>perf_counter_ns</w:t>
+        <w:t/>
       </w:r>
       <w:r>
         <w:rPr/>
-        <w:t xml:space="preserve">; elapsed nanoseconds become seconds per call. Comparison order alternates, and raw samples plus minimum, median and maximum timings are retained. </w:t>
+        <w:t xml:space="preserve"/>
       </w:r>
       <w:r>
         <w:rPr>
           <w:rFonts w:ascii="Consolas" w:hAnsi="Consolas" w:eastAsia="Consolas"/>
         </w:rPr>
-        <w:t>benchmark/results.json</w:t>
+        <w:t/>
       </w:r>
       <w:r>
         <w:rPr/>
-        <w:t xml:space="preserve"> contains a recorded and verified benchmark snapshot: 13 workloads, seed 2026, one warmup, five repeats and three calls per sample. It records shapes, tolerances, configuration and environment metadata; all six source hashes match.</w:t>
+        <w:t xml:space="preserve"/>
       </w:r>
     </w:p>
     <w:tbl>
@@ -2313,7 +2337,7 @@
               <w:rPr>
                 <w:sz w:val="18"/>
               </w:rPr>
-              <w:t>5.003</w:t>
+              <w:t>5.012</w:t>
             </w:r>
           </w:p>
         </w:tc>
@@ -2330,7 +2354,7 @@
               <w:rPr>
                 <w:sz w:val="18"/>
               </w:rPr>
-              <w:t>0.625</w:t>
+              <w:t>0.644</w:t>
             </w:r>
           </w:p>
         </w:tc>
@@ -2347,7 +2371,7 @@
               <w:rPr>
                 <w:sz w:val="18"/>
               </w:rPr>
-              <w:t>8.0×</w:t>
+              <w:t>7.8×</w:t>
             </w:r>
           </w:p>
         </w:tc>
@@ -2399,7 +2423,7 @@
               <w:rPr>
                 <w:sz w:val="18"/>
               </w:rPr>
-              <w:t>3.054</w:t>
+              <w:t>3.066</w:t>
             </w:r>
           </w:p>
         </w:tc>
@@ -2416,7 +2440,7 @@
               <w:rPr>
                 <w:sz w:val="18"/>
               </w:rPr>
-              <w:t>0.018</w:t>
+              <w:t>0.017</w:t>
             </w:r>
           </w:p>
         </w:tc>
@@ -2433,7 +2457,7 @@
               <w:rPr>
                 <w:sz w:val="18"/>
               </w:rPr>
-              <w:t>166.3×</w:t>
+              <w:t>180.4×</w:t>
             </w:r>
           </w:p>
         </w:tc>
@@ -2485,7 +2509,7 @@
               <w:rPr>
                 <w:sz w:val="18"/>
               </w:rPr>
-              <w:t>8.227</w:t>
+              <w:t>7.410</w:t>
             </w:r>
           </w:p>
         </w:tc>
@@ -2502,7 +2526,7 @@
               <w:rPr>
                 <w:sz w:val="18"/>
               </w:rPr>
-              <w:t>0.205</w:t>
+              <w:t>0.181</w:t>
             </w:r>
           </w:p>
         </w:tc>
@@ -2519,7 +2543,7 @@
               <w:rPr>
                 <w:sz w:val="18"/>
               </w:rPr>
-              <w:t>40.1×</w:t>
+              <w:t>40.9×</w:t>
             </w:r>
           </w:p>
         </w:tc>
@@ -2571,7 +2595,7 @@
               <w:rPr>
                 <w:sz w:val="18"/>
               </w:rPr>
-              <w:t>6.342</w:t>
+              <w:t>6.088</w:t>
             </w:r>
           </w:p>
         </w:tc>
@@ -2588,7 +2612,7 @@
               <w:rPr>
                 <w:sz w:val="18"/>
               </w:rPr>
-              <w:t>0.217</w:t>
+              <w:t>0.187</w:t>
             </w:r>
           </w:p>
         </w:tc>
@@ -2605,7 +2629,7 @@
               <w:rPr>
                 <w:sz w:val="18"/>
               </w:rPr>
-              <w:t>29.3×</w:t>
+              <w:t>32.5×</w:t>
             </w:r>
           </w:p>
         </w:tc>
@@ -2657,7 +2681,7 @@
               <w:rPr>
                 <w:sz w:val="18"/>
               </w:rPr>
-              <w:t>4.676</w:t>
+              <w:t>4.979</w:t>
             </w:r>
           </w:p>
         </w:tc>
@@ -2674,7 +2698,7 @@
               <w:rPr>
                 <w:sz w:val="18"/>
               </w:rPr>
-              <w:t>0.454</w:t>
+              <w:t>0.449</w:t>
             </w:r>
           </w:p>
         </w:tc>
@@ -2691,7 +2715,7 @@
               <w:rPr>
                 <w:sz w:val="18"/>
               </w:rPr>
-              <w:t>10.3×</w:t>
+              <w:t>11.1×</w:t>
             </w:r>
           </w:p>
         </w:tc>
@@ -2743,7 +2767,7 @@
               <w:rPr>
                 <w:sz w:val="18"/>
               </w:rPr>
-              <w:t>5.131</w:t>
+              <w:t>5.383</w:t>
             </w:r>
           </w:p>
         </w:tc>
@@ -2760,7 +2784,7 @@
               <w:rPr>
                 <w:sz w:val="18"/>
               </w:rPr>
-              <w:t>0.047</w:t>
+              <w:t>0.050</w:t>
             </w:r>
           </w:p>
         </w:tc>
@@ -2777,7 +2801,7 @@
               <w:rPr>
                 <w:sz w:val="18"/>
               </w:rPr>
-              <w:t>109.8×</w:t>
+              <w:t>108.3×</w:t>
             </w:r>
           </w:p>
         </w:tc>
@@ -2798,7 +2822,7 @@
     <w:p>
       <w:r>
         <w:rPr/>
-        <w:t>Current benchmarks cover utilities, differentiation and composition only. Utilities use loop comparisons; derivatives use untimed analytic checks. Composition uses direct utility comparisons and adapters that learn no parameters, measuring overhead rather than preprocessing training. Timings concern one environment and finite float64 workloads. Preprocessing, sorting/searching, ranking, statistics, metrics and I/O benchmarks await merged modules, integrated tests and the required notebook demonstration.</w:t>
+        <w:t>The integrated benchmark set covers utilities, differentiation, pipeline composition, statistics and metrics. Utilities, statistics and metrics use correctness-checked loop or pairwise baselines; derivatives use untimed analytic checks. Composition uses direct utility comparisons and adapters that learn no parameters, measuring overhead rather than preprocessing training. Timings concern one environment and finite float64 workloads; preprocessing, sorting/searching, ranking and I/O do not currently have benchmark cases. The integrated CSV pipeline smoke test and Quickstart script, notebook checker and fresh AIML-kernel notebook execution passed.</w:t>
       </w:r>
     </w:p>
     <w:p>

</xml_diff>